<commit_message>
Fix exhibit TOC page numbering
</commit_message>
<xml_diff>
--- a/docassemble/AssemblyLine/data/templates/exhibit_table_of_contents.docx
+++ b/docassemble/AssemblyLine/data/templates/exhibit_table_of_contents.docx
@@ -334,23 +334,23 @@
           <w:sz w:val="24"/>
           <w:szCs w:val="24"/>
         </w:rPr>
-        <w:t>{% if include_exhibit_cover_pages %}{{ exhibit.</w:t>
-      </w:r>
-      <w:r>
-        <w:rPr>
-          <w:rFonts w:ascii="Times New Roman" w:hAnsi="Times New Roman" w:cs="Times New Roman"/>
-          <w:sz w:val="24"/>
-          <w:szCs w:val="24"/>
-        </w:rPr>
-        <w:t>start_page</w:t>
-      </w:r>
-      <w:r>
-        <w:rPr>
-          <w:rFonts w:ascii="Times New Roman" w:hAnsi="Times New Roman" w:cs="Times New Roman"/>
-          <w:sz w:val="24"/>
-          <w:szCs w:val="24"/>
-        </w:rPr>
-        <w:t xml:space="preserve"> + </w:t>
+        <w:t>{% if include_exhibit_cover_pages %}{{ exhibit.toc_page_number(</w:t>
+      </w:r>
+      <w:r>
+        <w:rPr>
+          <w:rFonts w:ascii="Times New Roman" w:hAnsi="Times New Roman" w:cs="Times New Roman"/>
+          <w:sz w:val="24"/>
+          <w:szCs w:val="24"/>
+        </w:rPr>
+        <w:t>table_page_length</w:t>
+      </w:r>
+      <w:r>
+        <w:rPr>
+          <w:rFonts w:ascii="Times New Roman" w:hAnsi="Times New Roman" w:cs="Times New Roman"/>
+          <w:sz w:val="24"/>
+          <w:szCs w:val="24"/>
+        </w:rPr>
+        <w:t xml:space="preserve">, </w:t>
       </w:r>
       <w:r>
         <w:rPr>
@@ -359,7 +359,7 @@
           <w:szCs w:val="24"/>
           <w:highlight w:val="cyan"/>
         </w:rPr>
-        <w:t>loop.index</w:t>
+        <w:t>True</w:t>
       </w:r>
       <w:r>
         <w:rPr>
@@ -375,23 +375,23 @@
           <w:sz w:val="24"/>
           <w:szCs w:val="24"/>
         </w:rPr>
-        <w:t xml:space="preserve">+ </w:t>
-      </w:r>
-      <w:r>
-        <w:rPr>
-          <w:rFonts w:ascii="Times New Roman" w:hAnsi="Times New Roman" w:cs="Times New Roman"/>
-          <w:sz w:val="24"/>
-          <w:szCs w:val="24"/>
-        </w:rPr>
-        <w:t xml:space="preserve">table_page_length </w:t>
-      </w:r>
-      <w:r>
-        <w:rPr>
-          <w:rFonts w:ascii="Times New Roman" w:hAnsi="Times New Roman" w:cs="Times New Roman"/>
-          <w:sz w:val="24"/>
-          <w:szCs w:val="24"/>
-        </w:rPr>
-        <w:t xml:space="preserve">- 1 </w:t>
+        <w:t/>
+      </w:r>
+      <w:r>
+        <w:rPr>
+          <w:rFonts w:ascii="Times New Roman" w:hAnsi="Times New Roman" w:cs="Times New Roman"/>
+          <w:sz w:val="24"/>
+          <w:szCs w:val="24"/>
+        </w:rPr>
+        <w:t/>
+      </w:r>
+      <w:r>
+        <w:rPr>
+          <w:rFonts w:ascii="Times New Roman" w:hAnsi="Times New Roman" w:cs="Times New Roman"/>
+          <w:sz w:val="24"/>
+          <w:szCs w:val="24"/>
+        </w:rPr>
+        <w:t>)</w:t>
       </w:r>
       <w:r>
         <w:rPr>
@@ -407,39 +407,39 @@
           <w:sz w:val="24"/>
           <w:szCs w:val="24"/>
         </w:rPr>
-        <w:t>table_page_length</w:t>
-      </w:r>
-      <w:r>
-        <w:rPr>
-          <w:rFonts w:ascii="Times New Roman" w:hAnsi="Times New Roman" w:cs="Times New Roman"/>
-          <w:sz w:val="24"/>
-          <w:szCs w:val="24"/>
-        </w:rPr>
-        <w:t xml:space="preserve"> + </w:t>
-      </w:r>
-      <w:r>
-        <w:rPr>
-          <w:rFonts w:ascii="Times New Roman" w:hAnsi="Times New Roman" w:cs="Times New Roman"/>
-          <w:sz w:val="24"/>
-          <w:szCs w:val="24"/>
-        </w:rPr>
-        <w:t>exhibit.</w:t>
-      </w:r>
-      <w:r>
-        <w:rPr>
-          <w:rFonts w:ascii="Times New Roman" w:hAnsi="Times New Roman" w:cs="Times New Roman"/>
-          <w:sz w:val="24"/>
-          <w:szCs w:val="24"/>
-        </w:rPr>
-        <w:t>start_page</w:t>
-      </w:r>
-      <w:r>
-        <w:rPr>
-          <w:rFonts w:ascii="Times New Roman" w:hAnsi="Times New Roman" w:cs="Times New Roman"/>
-          <w:sz w:val="24"/>
-          <w:szCs w:val="24"/>
-        </w:rPr>
-        <w:t xml:space="preserve"> </w:t>
+        <w:t>exhibit.toc_page_number(</w:t>
+      </w:r>
+      <w:r>
+        <w:rPr>
+          <w:rFonts w:ascii="Times New Roman" w:hAnsi="Times New Roman" w:cs="Times New Roman"/>
+          <w:sz w:val="24"/>
+          <w:szCs w:val="24"/>
+        </w:rPr>
+        <w:t xml:space="preserve">table_page_length, </w:t>
+      </w:r>
+      <w:r>
+        <w:rPr>
+          <w:rFonts w:ascii="Times New Roman" w:hAnsi="Times New Roman" w:cs="Times New Roman"/>
+          <w:sz w:val="24"/>
+          <w:szCs w:val="24"/>
+        </w:rPr>
+        <w:t>False</w:t>
+      </w:r>
+      <w:r>
+        <w:rPr>
+          <w:rFonts w:ascii="Times New Roman" w:hAnsi="Times New Roman" w:cs="Times New Roman"/>
+          <w:sz w:val="24"/>
+          <w:szCs w:val="24"/>
+        </w:rPr>
+        <w:t>)</w:t>
+      </w:r>
+      <w:r>
+        <w:rPr>
+          <w:rFonts w:ascii="Times New Roman" w:hAnsi="Times New Roman" w:cs="Times New Roman"/>
+          <w:sz w:val="24"/>
+          <w:szCs w:val="24"/>
+        </w:rPr>
+        <w:t/>
       </w:r>
       <w:r>
         <w:rPr>

</xml_diff>